<commit_message>
Fix Windows Hypercube result tracking and run UI
</commit_message>
<xml_diff>
--- a/windows/docs/user/VisionEval-Workbench-2.0-Whats-New-Windows.docx
+++ b/windows/docs/user/VisionEval-Workbench-2.0-Whats-New-Windows.docx
@@ -294,19 +294,6 @@
       </w:pPr>
       <w:r>
         <w:t>Hypercubes are safe on laptops. Systems below 16 GB of RAM receive advisory guidance, while low workspace capacity produces a confirmation warning rather than an automatic block.</w:t>
-      </w:r>
-    </w:p>
-    <w:p>
-      <w:pPr>
-        <w:pStyle w:val="Heading2"/>
-      </w:pPr>
-      <w:r>
-        <w:t>Unsigned release candidate</w:t>
-      </w:r>
-    </w:p>
-    <w:p>
-      <w:r>
-        <w:t>This local candidate is not Authenticode-signed. Windows may show a SmartScreen or unknown-publisher warning. Publisher identity has not been verified; do not disable SmartScreen globally.</w:t>
       </w:r>
     </w:p>
     <w:sectPr>

</xml_diff>